<commit_message>
Removed English related code
</commit_message>
<xml_diff>
--- a/(Do Not Open)/Template/Chaewan_Woo_Resume_Kor.docx
+++ b/(Do Not Open)/Template/Chaewan_Woo_Resume_Kor.docx
@@ -4,7 +4,7 @@
   <w:body>
     <w:p>
       <w:pPr>
-        <w:pStyle w:val="Title"/>
+        <w:pStyle w:val="a4"/>
         <w:rPr>
           <w:rFonts w:ascii="바탕" w:eastAsia="바탕" w:hAnsi="바탕"/>
           <w:sz w:val="56"/>
@@ -31,7 +31,7 @@
     </w:p>
     <w:p>
       <w:pPr>
-        <w:pStyle w:val="Heading1"/>
+        <w:pStyle w:val="1"/>
         <w:spacing w:line="276" w:lineRule="auto"/>
         <w:jc w:val="center"/>
         <w:rPr>
@@ -156,7 +156,7 @@
       <w:hyperlink r:id="rId8" w:history="1">
         <w:r>
           <w:rPr>
-            <w:rStyle w:val="Hyperlink"/>
+            <w:rStyle w:val="a6"/>
             <w:rFonts w:ascii="Times New Roman" w:eastAsia="바탕체" w:hAnsi="Times New Roman" w:cs="Times New Roman"/>
             <w:color w:val="auto"/>
             <w:w w:val="105"/>
@@ -222,7 +222,7 @@
     </w:p>
     <w:p>
       <w:pPr>
-        <w:pStyle w:val="Heading1"/>
+        <w:pStyle w:val="1"/>
         <w:spacing w:before="0" w:line="276" w:lineRule="auto"/>
         <w:jc w:val="center"/>
         <w:rPr>
@@ -275,7 +275,7 @@
       <w:hyperlink r:id="rId10" w:history="1">
         <w:r>
           <w:rPr>
-            <w:rStyle w:val="Hyperlink"/>
+            <w:rStyle w:val="a6"/>
             <w:rFonts w:ascii="Times New Roman" w:hAnsi="Times New Roman" w:cs="Times New Roman"/>
             <w:color w:val="auto"/>
             <w:w w:val="105"/>
@@ -329,7 +329,7 @@
       <w:hyperlink r:id="rId11" w:history="1">
         <w:r>
           <w:rPr>
-            <w:rStyle w:val="Hyperlink"/>
+            <w:rStyle w:val="a6"/>
             <w:rFonts w:ascii="Times New Roman" w:hAnsi="Times New Roman" w:cs="Times New Roman"/>
             <w:color w:val="auto"/>
             <w:w w:val="105"/>
@@ -343,7 +343,7 @@
     </w:p>
     <w:p>
       <w:pPr>
-        <w:pStyle w:val="Heading1"/>
+        <w:pStyle w:val="1"/>
         <w:rPr>
           <w:rFonts w:ascii="Times New Roman" w:eastAsia="PMingLiU-ExtB" w:hAnsi="Times New Roman" w:cs="Times New Roman"/>
           <w:lang w:eastAsia="ko-KR"/>
@@ -454,7 +454,7 @@
     </w:p>
     <w:p>
       <w:pPr>
-        <w:pStyle w:val="BodyText"/>
+        <w:pStyle w:val="a3"/>
         <w:spacing w:before="64" w:line="242" w:lineRule="exact"/>
         <w:ind w:left="215" w:firstLine="0"/>
         <w:rPr>
@@ -609,7 +609,7 @@
     </w:p>
     <w:p>
       <w:pPr>
-        <w:pStyle w:val="Heading1"/>
+        <w:pStyle w:val="1"/>
         <w:spacing w:before="213"/>
         <w:rPr>
           <w:rFonts w:ascii="Times New Roman" w:eastAsia="PMingLiU-ExtB" w:hAnsi="Times New Roman" w:cs="Times New Roman"/>
@@ -920,7 +920,7 @@
     </w:p>
     <w:p>
       <w:pPr>
-        <w:pStyle w:val="ListParagraph"/>
+        <w:pStyle w:val="a5"/>
         <w:numPr>
           <w:ilvl w:val="0"/>
           <w:numId w:val="1"/>
@@ -1031,7 +1031,7 @@
     </w:p>
     <w:p>
       <w:pPr>
-        <w:pStyle w:val="ListParagraph"/>
+        <w:pStyle w:val="a5"/>
         <w:numPr>
           <w:ilvl w:val="0"/>
           <w:numId w:val="1"/>
@@ -1114,22 +1114,33 @@
       </w:r>
       <w:r>
         <w:rPr>
-          <w:rFonts w:ascii="Times New Roman" w:eastAsia="바탕" w:hAnsi="Times New Roman" w:cs="Times New Roman"/>
+          <w:rFonts w:ascii="바탕" w:eastAsia="바탕" w:hAnsi="바탕" w:cs="바탕체"/>
           <w:w w:val="110"/>
           <w:sz w:val="20"/>
           <w:lang w:eastAsia="ko-KR"/>
         </w:rPr>
-        <w:t>우등</w:t>
-      </w:r>
-      <w:r>
-        <w:rPr>
-          <w:rFonts w:ascii="Times New Roman" w:eastAsia="PMingLiU-ExtB" w:hAnsi="Times New Roman" w:cs="Times New Roman"/>
+        <w:t>최</w:t>
+      </w:r>
+      <w:r>
+        <w:rPr>
+          <w:rFonts w:ascii="바탕" w:eastAsia="바탕" w:hAnsi="바탕" w:cs="Times New Roman"/>
           <w:w w:val="110"/>
           <w:sz w:val="20"/>
           <w:lang w:eastAsia="ko-KR"/>
         </w:rPr>
-        <w:t xml:space="preserve"> </w:t>
-      </w:r>
+        <w:t>우수</w:t>
+      </w:r>
+      <w:r>
+        <w:rPr>
+          <w:rFonts w:ascii="Times New Roman" w:eastAsia="PMingLiU-ExtB" w:hAnsi="Times New Roman" w:cs="Times New Roman"/>
+          <w:w w:val="110"/>
+          <w:sz w:val="20"/>
+          <w:lang w:eastAsia="ko-KR"/>
+        </w:rPr>
+        <w:t xml:space="preserve"> </w:t>
+      </w:r>
+      <w:bookmarkStart w:id="2" w:name="_GoBack"/>
+      <w:bookmarkEnd w:id="2"/>
       <w:r>
         <w:rPr>
           <w:rFonts w:ascii="Times New Roman" w:eastAsia="바탕" w:hAnsi="Times New Roman" w:cs="Times New Roman"/>
@@ -1151,7 +1162,7 @@
     </w:p>
     <w:p>
       <w:pPr>
-        <w:pStyle w:val="ListParagraph"/>
+        <w:pStyle w:val="a5"/>
         <w:numPr>
           <w:ilvl w:val="0"/>
           <w:numId w:val="1"/>
@@ -1765,7 +1776,7 @@
     </w:p>
     <w:p>
       <w:pPr>
-        <w:pStyle w:val="ListParagraph"/>
+        <w:pStyle w:val="a5"/>
         <w:numPr>
           <w:ilvl w:val="0"/>
           <w:numId w:val="1"/>
@@ -2089,7 +2100,7 @@
     </w:p>
     <w:p>
       <w:pPr>
-        <w:pStyle w:val="ListParagraph"/>
+        <w:pStyle w:val="a5"/>
         <w:numPr>
           <w:ilvl w:val="0"/>
           <w:numId w:val="1"/>
@@ -2354,7 +2365,7 @@
     </w:p>
     <w:p>
       <w:pPr>
-        <w:pStyle w:val="ListParagraph"/>
+        <w:pStyle w:val="a5"/>
         <w:numPr>
           <w:ilvl w:val="0"/>
           <w:numId w:val="1"/>
@@ -2714,7 +2725,7 @@
     </w:p>
     <w:p>
       <w:pPr>
-        <w:pStyle w:val="ListParagraph"/>
+        <w:pStyle w:val="a5"/>
         <w:numPr>
           <w:ilvl w:val="0"/>
           <w:numId w:val="1"/>
@@ -3009,7 +3020,7 @@
     </w:p>
     <w:p>
       <w:pPr>
-        <w:pStyle w:val="Heading1"/>
+        <w:pStyle w:val="1"/>
         <w:rPr>
           <w:rFonts w:ascii="Times New Roman" w:eastAsia="PMingLiU-ExtB" w:hAnsi="Times New Roman" w:cs="Times New Roman"/>
         </w:rPr>
@@ -3095,8 +3106,8 @@
           </mc:Fallback>
         </mc:AlternateContent>
       </w:r>
-      <w:bookmarkStart w:id="2" w:name="Projects"/>
-      <w:bookmarkEnd w:id="2"/>
+      <w:bookmarkStart w:id="3" w:name="Projects"/>
+      <w:bookmarkEnd w:id="3"/>
       <w:r>
         <w:rPr>
           <w:rFonts w:ascii="Times New Roman" w:eastAsia="PMingLiU-ExtB" w:hAnsi="Times New Roman" w:cs="Times New Roman"/>
@@ -3126,7 +3137,7 @@
       </w:r>
       <w:r>
         <w:rPr>
-          <w:rStyle w:val="Hyperlink"/>
+          <w:rStyle w:val="a6"/>
           <w:rFonts w:ascii="Times New Roman" w:eastAsia="PMingLiU-ExtB" w:hAnsi="Times New Roman" w:cs="Times New Roman"/>
           <w:w w:val="115"/>
         </w:rPr>
@@ -3326,7 +3337,7 @@
     </w:p>
     <w:p>
       <w:pPr>
-        <w:pStyle w:val="ListParagraph"/>
+        <w:pStyle w:val="a5"/>
         <w:numPr>
           <w:ilvl w:val="0"/>
           <w:numId w:val="1"/>
@@ -3518,7 +3529,7 @@
     </w:p>
     <w:p>
       <w:pPr>
-        <w:pStyle w:val="ListParagraph"/>
+        <w:pStyle w:val="a5"/>
         <w:numPr>
           <w:ilvl w:val="0"/>
           <w:numId w:val="1"/>
@@ -3800,7 +3811,7 @@
     </w:p>
     <w:p>
       <w:pPr>
-        <w:pStyle w:val="ListParagraph"/>
+        <w:pStyle w:val="a5"/>
         <w:numPr>
           <w:ilvl w:val="0"/>
           <w:numId w:val="1"/>
@@ -4150,7 +4161,7 @@
     </w:p>
     <w:p>
       <w:pPr>
-        <w:pStyle w:val="ListParagraph"/>
+        <w:pStyle w:val="a5"/>
         <w:numPr>
           <w:ilvl w:val="0"/>
           <w:numId w:val="1"/>
@@ -4288,7 +4299,7 @@
     </w:p>
     <w:p>
       <w:pPr>
-        <w:pStyle w:val="ListParagraph"/>
+        <w:pStyle w:val="a5"/>
         <w:numPr>
           <w:ilvl w:val="0"/>
           <w:numId w:val="1"/>
@@ -4435,7 +4446,7 @@
     </w:p>
     <w:p>
       <w:pPr>
-        <w:pStyle w:val="ListParagraph"/>
+        <w:pStyle w:val="a5"/>
         <w:numPr>
           <w:ilvl w:val="0"/>
           <w:numId w:val="1"/>
@@ -4854,7 +4865,7 @@
     </w:p>
     <w:p>
       <w:pPr>
-        <w:pStyle w:val="ListParagraph"/>
+        <w:pStyle w:val="a5"/>
         <w:numPr>
           <w:ilvl w:val="0"/>
           <w:numId w:val="1"/>
@@ -5010,7 +5021,7 @@
     </w:p>
     <w:p>
       <w:pPr>
-        <w:pStyle w:val="ListParagraph"/>
+        <w:pStyle w:val="a5"/>
         <w:numPr>
           <w:ilvl w:val="0"/>
           <w:numId w:val="1"/>
@@ -5238,7 +5249,7 @@
     </w:p>
     <w:p>
       <w:pPr>
-        <w:pStyle w:val="ListParagraph"/>
+        <w:pStyle w:val="a5"/>
         <w:numPr>
           <w:ilvl w:val="0"/>
           <w:numId w:val="1"/>
@@ -5475,7 +5486,7 @@
     </w:p>
     <w:p>
       <w:pPr>
-        <w:pStyle w:val="ListParagraph"/>
+        <w:pStyle w:val="a5"/>
         <w:numPr>
           <w:ilvl w:val="0"/>
           <w:numId w:val="1"/>
@@ -5802,7 +5813,7 @@
     </w:p>
     <w:p>
       <w:pPr>
-        <w:pStyle w:val="Heading1"/>
+        <w:pStyle w:val="1"/>
         <w:spacing w:before="229"/>
         <w:rPr>
           <w:rFonts w:ascii="Times New Roman" w:eastAsia="PMingLiU-ExtB" w:hAnsi="Times New Roman" w:cs="Times New Roman"/>
@@ -5906,7 +5917,7 @@
     </w:p>
     <w:p>
       <w:pPr>
-        <w:pStyle w:val="Heading1"/>
+        <w:pStyle w:val="1"/>
         <w:spacing w:before="229"/>
         <w:ind w:firstLine="216"/>
         <w:rPr>
@@ -6414,7 +6425,7 @@
     </w:p>
     <w:p>
       <w:pPr>
-        <w:pStyle w:val="ListParagraph"/>
+        <w:pStyle w:val="a5"/>
         <w:tabs>
           <w:tab w:val="left" w:pos="696"/>
         </w:tabs>
@@ -6431,7 +6442,7 @@
     </w:p>
     <w:p>
       <w:pPr>
-        <w:pStyle w:val="ListParagraph"/>
+        <w:pStyle w:val="a5"/>
         <w:numPr>
           <w:ilvl w:val="0"/>
           <w:numId w:val="1"/>
@@ -6561,7 +6572,7 @@
     </w:p>
     <w:p>
       <w:pPr>
-        <w:pStyle w:val="ListParagraph"/>
+        <w:pStyle w:val="a5"/>
         <w:numPr>
           <w:ilvl w:val="0"/>
           <w:numId w:val="1"/>
@@ -6652,7 +6663,7 @@
     </w:p>
     <w:p>
       <w:pPr>
-        <w:pStyle w:val="ListParagraph"/>
+        <w:pStyle w:val="a5"/>
         <w:numPr>
           <w:ilvl w:val="0"/>
           <w:numId w:val="1"/>
@@ -6731,12 +6742,10 @@
         </w:rPr>
         <w:t>위</w:t>
       </w:r>
-      <w:bookmarkStart w:id="3" w:name="_GoBack"/>
-      <w:bookmarkEnd w:id="3"/>
     </w:p>
     <w:p>
       <w:pPr>
-        <w:pStyle w:val="ListParagraph"/>
+        <w:pStyle w:val="a5"/>
         <w:numPr>
           <w:ilvl w:val="0"/>
           <w:numId w:val="1"/>
@@ -6824,7 +6833,7 @@
     </w:p>
     <w:p>
       <w:pPr>
-        <w:pStyle w:val="ListParagraph"/>
+        <w:pStyle w:val="a5"/>
         <w:numPr>
           <w:ilvl w:val="0"/>
           <w:numId w:val="1"/>
@@ -7723,7 +7732,7 @@
     <w:lsdException w:name="List Table 6 Colorful Accent 6" w:uiPriority="51"/>
     <w:lsdException w:name="List Table 7 Colorful Accent 6" w:uiPriority="52"/>
   </w:latentStyles>
-  <w:style w:type="paragraph" w:default="1" w:styleId="Normal">
+  <w:style w:type="paragraph" w:default="1" w:styleId="a">
     <w:name w:val="Normal"/>
     <w:uiPriority w:val="1"/>
     <w:qFormat/>
@@ -7731,9 +7740,9 @@
       <w:rFonts w:ascii="Calibri" w:eastAsia="Calibri" w:hAnsi="Calibri" w:cs="Calibri"/>
     </w:rPr>
   </w:style>
-  <w:style w:type="paragraph" w:styleId="Heading1">
+  <w:style w:type="paragraph" w:styleId="1">
     <w:name w:val="heading 1"/>
-    <w:basedOn w:val="Normal"/>
+    <w:basedOn w:val="a"/>
     <w:uiPriority w:val="1"/>
     <w:qFormat/>
     <w:pPr>
@@ -7745,13 +7754,13 @@
       <w:szCs w:val="24"/>
     </w:rPr>
   </w:style>
-  <w:style w:type="character" w:default="1" w:styleId="DefaultParagraphFont">
+  <w:style w:type="character" w:default="1" w:styleId="a0">
     <w:name w:val="Default Paragraph Font"/>
     <w:uiPriority w:val="1"/>
     <w:semiHidden/>
     <w:unhideWhenUsed/>
   </w:style>
-  <w:style w:type="table" w:default="1" w:styleId="TableNormal">
+  <w:style w:type="table" w:default="1" w:styleId="a1">
     <w:name w:val="Normal Table"/>
     <w:uiPriority w:val="99"/>
     <w:semiHidden/>
@@ -7766,15 +7775,15 @@
       </w:tblCellMar>
     </w:tblPr>
   </w:style>
-  <w:style w:type="numbering" w:default="1" w:styleId="NoList">
+  <w:style w:type="numbering" w:default="1" w:styleId="a2">
     <w:name w:val="No List"/>
     <w:uiPriority w:val="99"/>
     <w:semiHidden/>
     <w:unhideWhenUsed/>
   </w:style>
-  <w:style w:type="paragraph" w:styleId="BodyText">
+  <w:style w:type="paragraph" w:styleId="a3">
     <w:name w:val="Body Text"/>
-    <w:basedOn w:val="Normal"/>
+    <w:basedOn w:val="a"/>
     <w:uiPriority w:val="1"/>
     <w:qFormat/>
     <w:pPr>
@@ -7786,9 +7795,9 @@
       <w:szCs w:val="20"/>
     </w:rPr>
   </w:style>
-  <w:style w:type="paragraph" w:styleId="Title">
+  <w:style w:type="paragraph" w:styleId="a4">
     <w:name w:val="Title"/>
-    <w:basedOn w:val="Normal"/>
+    <w:basedOn w:val="a"/>
     <w:uiPriority w:val="1"/>
     <w:qFormat/>
     <w:pPr>
@@ -7803,9 +7812,9 @@
       <w:szCs w:val="49"/>
     </w:rPr>
   </w:style>
-  <w:style w:type="paragraph" w:styleId="ListParagraph">
+  <w:style w:type="paragraph" w:styleId="a5">
     <w:name w:val="List Paragraph"/>
-    <w:basedOn w:val="Normal"/>
+    <w:basedOn w:val="a"/>
     <w:uiPriority w:val="1"/>
     <w:qFormat/>
     <w:pPr>
@@ -7815,13 +7824,13 @@
   </w:style>
   <w:style w:type="paragraph" w:customStyle="1" w:styleId="TableParagraph">
     <w:name w:val="Table Paragraph"/>
-    <w:basedOn w:val="Normal"/>
+    <w:basedOn w:val="a"/>
     <w:uiPriority w:val="1"/>
     <w:qFormat/>
   </w:style>
-  <w:style w:type="character" w:styleId="Hyperlink">
+  <w:style w:type="character" w:styleId="a6">
     <w:name w:val="Hyperlink"/>
-    <w:basedOn w:val="DefaultParagraphFont"/>
+    <w:basedOn w:val="a0"/>
     <w:uiPriority w:val="99"/>
     <w:unhideWhenUsed/>
     <w:rsid w:val="00DB4B48"/>
@@ -7830,10 +7839,10 @@
       <w:u w:val="single"/>
     </w:rPr>
   </w:style>
-  <w:style w:type="paragraph" w:styleId="Header">
+  <w:style w:type="paragraph" w:styleId="a7">
     <w:name w:val="header"/>
-    <w:basedOn w:val="Normal"/>
-    <w:link w:val="HeaderChar"/>
+    <w:basedOn w:val="a"/>
+    <w:link w:val="Char"/>
     <w:uiPriority w:val="99"/>
     <w:unhideWhenUsed/>
     <w:rsid w:val="00E6314A"/>
@@ -7845,20 +7854,20 @@
       <w:snapToGrid w:val="0"/>
     </w:pPr>
   </w:style>
-  <w:style w:type="character" w:customStyle="1" w:styleId="HeaderChar">
-    <w:name w:val="Header Char"/>
-    <w:basedOn w:val="DefaultParagraphFont"/>
-    <w:link w:val="Header"/>
+  <w:style w:type="character" w:customStyle="1" w:styleId="Char">
+    <w:name w:val="머리글 Char"/>
+    <w:basedOn w:val="a0"/>
+    <w:link w:val="a7"/>
     <w:uiPriority w:val="99"/>
     <w:rsid w:val="00E6314A"/>
     <w:rPr>
       <w:rFonts w:ascii="Calibri" w:eastAsia="Calibri" w:hAnsi="Calibri" w:cs="Calibri"/>
     </w:rPr>
   </w:style>
-  <w:style w:type="paragraph" w:styleId="Footer">
+  <w:style w:type="paragraph" w:styleId="a8">
     <w:name w:val="footer"/>
-    <w:basedOn w:val="Normal"/>
-    <w:link w:val="FooterChar"/>
+    <w:basedOn w:val="a"/>
+    <w:link w:val="Char0"/>
     <w:uiPriority w:val="99"/>
     <w:unhideWhenUsed/>
     <w:rsid w:val="00E6314A"/>
@@ -7870,19 +7879,19 @@
       <w:snapToGrid w:val="0"/>
     </w:pPr>
   </w:style>
-  <w:style w:type="character" w:customStyle="1" w:styleId="FooterChar">
-    <w:name w:val="Footer Char"/>
-    <w:basedOn w:val="DefaultParagraphFont"/>
-    <w:link w:val="Footer"/>
+  <w:style w:type="character" w:customStyle="1" w:styleId="Char0">
+    <w:name w:val="바닥글 Char"/>
+    <w:basedOn w:val="a0"/>
+    <w:link w:val="a8"/>
     <w:uiPriority w:val="99"/>
     <w:rsid w:val="00E6314A"/>
     <w:rPr>
       <w:rFonts w:ascii="Calibri" w:eastAsia="Calibri" w:hAnsi="Calibri" w:cs="Calibri"/>
     </w:rPr>
   </w:style>
-  <w:style w:type="character" w:styleId="FollowedHyperlink">
+  <w:style w:type="character" w:styleId="a9">
     <w:name w:val="FollowedHyperlink"/>
-    <w:basedOn w:val="DefaultParagraphFont"/>
+    <w:basedOn w:val="a0"/>
     <w:uiPriority w:val="99"/>
     <w:semiHidden/>
     <w:unhideWhenUsed/>
@@ -8183,7 +8192,7 @@
 </file>
 
 <file path=customXml/itemProps1.xml><?xml version="1.0" encoding="utf-8"?>
-<ds:datastoreItem xmlns:ds="http://schemas.openxmlformats.org/officeDocument/2006/customXml" ds:itemID="{EFA298B5-9EC3-4095-A887-F4C98F4827F8}">
+<ds:datastoreItem xmlns:ds="http://schemas.openxmlformats.org/officeDocument/2006/customXml" ds:itemID="{9585EAFB-5DBF-4514-A2C3-CA77ECA8D003}">
   <ds:schemaRefs>
     <ds:schemaRef ds:uri="http://schemas.openxmlformats.org/officeDocument/2006/bibliography"/>
   </ds:schemaRefs>

</xml_diff>